<commit_message>
docs: add JDM front/back matter (authors + required statements)
Add author block (Dandy Aulya, Lury Sofyan, Dimas Prasetyo, Fadel Aribowo)
with corresponding-author/ORCID placeholders, and the JDM-required sections:
Acknowledgements (incl. generative-AI disclosure), Author Contributions
(CRediT), Competing Interests, Data Availability Statement, and Financial
Support. Strip Word-embedded fonts to slim the file (1.9 MB -> 0.29 MB).

Co-Authored-By: Claude Opus 4.8 <noreply@anthropic.com>
</commit_message>
<xml_diff>
--- a/docs/Risk_Preference_Draft.docx
+++ b/docs/Risk_Preference_Draft.docx
@@ -17,6 +17,93 @@
           <w:bCs/>
         </w:rPr>
         <w:t>Does Cognitive Ability Predict Risk Preference or Task Comprehension? Disentangling Two Channels in a Large Indonesian Survey</w:t>
+      </w:r>
+    </w:p>
+    <w:p>
+      <w:pPr>
+        <w:jc w:val="center"/>
+      </w:pPr>
+      <w:r>
+        <w:rPr>
+          <w:rFonts w:ascii="Arial Unicode MS" w:eastAsia="Arial Unicode MS" w:hAnsi="Arial Unicode MS" w:cs="Arial Unicode MS"/>
+          <w:b w:val="0"/>
+        </w:rPr>
+        <w:t>Dandy Aulya¹, Lury Sofyan², Dimas Prasetyo³, and Fadel Aribowo⁴</w:t>
+      </w:r>
+    </w:p>
+    <w:p>
+      <w:pPr>
+        <w:jc w:val="center"/>
+      </w:pPr>
+      <w:r>
+        <w:rPr>
+          <w:rFonts w:ascii="Arial Unicode MS" w:eastAsia="Arial Unicode MS" w:hAnsi="Arial Unicode MS" w:cs="Arial Unicode MS"/>
+          <w:b w:val="0"/>
+          <w:i/>
+        </w:rPr>
+        <w:t>¹ [Department, Institution], Indonesia</w:t>
+      </w:r>
+    </w:p>
+    <w:p>
+      <w:pPr>
+        <w:jc w:val="center"/>
+      </w:pPr>
+      <w:r>
+        <w:rPr>
+          <w:rFonts w:ascii="Arial Unicode MS" w:eastAsia="Arial Unicode MS" w:hAnsi="Arial Unicode MS" w:cs="Arial Unicode MS"/>
+          <w:b w:val="0"/>
+          <w:i/>
+        </w:rPr>
+        <w:t>² [Department, Institution], Indonesia</w:t>
+      </w:r>
+    </w:p>
+    <w:p>
+      <w:pPr>
+        <w:jc w:val="center"/>
+      </w:pPr>
+      <w:r>
+        <w:rPr>
+          <w:rFonts w:ascii="Arial Unicode MS" w:eastAsia="Arial Unicode MS" w:hAnsi="Arial Unicode MS" w:cs="Arial Unicode MS"/>
+          <w:b w:val="0"/>
+          <w:i/>
+        </w:rPr>
+        <w:t>³ [Department, Institution], Indonesia</w:t>
+      </w:r>
+    </w:p>
+    <w:p>
+      <w:pPr>
+        <w:jc w:val="center"/>
+      </w:pPr>
+      <w:r>
+        <w:rPr>
+          <w:rFonts w:ascii="Arial Unicode MS" w:eastAsia="Arial Unicode MS" w:hAnsi="Arial Unicode MS" w:cs="Arial Unicode MS"/>
+          <w:b w:val="0"/>
+          <w:i/>
+        </w:rPr>
+        <w:t>⁴ [Department, Institution], Indonesia</w:t>
+      </w:r>
+    </w:p>
+    <w:p>
+      <w:pPr>
+        <w:jc w:val="center"/>
+      </w:pPr>
+      <w:r>
+        <w:rPr>
+          <w:rFonts w:ascii="Arial Unicode MS" w:eastAsia="Arial Unicode MS" w:hAnsi="Arial Unicode MS" w:cs="Arial Unicode MS"/>
+          <w:b w:val="0"/>
+        </w:rPr>
+        <w:t>Corresponding author: Dandy Aulya, [email address]. ORCID: [0000-0000-0000-0000].</w:t>
+      </w:r>
+    </w:p>
+    <w:p>
+      <w:pPr>
+        <w:jc w:val="center"/>
+      </w:pPr>
+      <w:r>
+        <w:rPr>
+          <w:rFonts w:ascii="Arial Unicode MS" w:eastAsia="Arial Unicode MS" w:hAnsi="Arial Unicode MS" w:cs="Arial Unicode MS"/>
+        </w:rPr>
+        <w:t xml:space="preserve"> </w:t>
       </w:r>
     </w:p>
     <w:p>
@@ -18161,6 +18248,186 @@
         <w:spacing w:before="240" w:after="240"/>
       </w:pPr>
       <w:r>
+        <w:t xml:space="preserve"> </w:t>
+      </w:r>
+    </w:p>
+    <w:p>
+      <w:pPr>
+        <w:jc w:val="left"/>
+      </w:pPr>
+      <w:r>
+        <w:rPr>
+          <w:b/>
+          <w:bCs/>
+          <w:i/>
+          <w:iCs/>
+        </w:rPr>
+        <w:t>Acknowledgements</w:t>
+      </w:r>
+    </w:p>
+    <w:p>
+      <w:pPr>
+        <w:jc w:val="both"/>
+      </w:pPr>
+      <w:r>
+        <w:rPr>
+          <w:rFonts w:ascii="Arial Unicode MS" w:eastAsia="Arial Unicode MS" w:hAnsi="Arial Unicode MS" w:cs="Arial Unicode MS"/>
+        </w:rPr>
+        <w:t>The authors thank the RAND Corporation and the survey teams responsible for the Indonesian Family Life Survey for collecting and maintaining the data used in this study. During the preparation of this manuscript, the authors used a generative AI–based language tool to copy-edit and improve the readability of parts of the text; the authors reviewed and verified all content and take full responsibility for the final manuscript.</w:t>
+      </w:r>
+    </w:p>
+    <w:p>
+      <w:pPr>
+        <w:jc w:val="left"/>
+      </w:pPr>
+      <w:r>
+        <w:rPr>
+          <w:rFonts w:ascii="Arial Unicode MS" w:eastAsia="Arial Unicode MS" w:hAnsi="Arial Unicode MS" w:cs="Arial Unicode MS"/>
+        </w:rPr>
+        <w:t xml:space="preserve"> </w:t>
+      </w:r>
+    </w:p>
+    <w:p>
+      <w:pPr>
+        <w:jc w:val="left"/>
+      </w:pPr>
+      <w:r>
+        <w:rPr>
+          <w:b/>
+          <w:bCs/>
+          <w:i/>
+          <w:iCs/>
+        </w:rPr>
+        <w:t>Author Contributions</w:t>
+      </w:r>
+    </w:p>
+    <w:p>
+      <w:pPr>
+        <w:jc w:val="both"/>
+      </w:pPr>
+      <w:r>
+        <w:rPr>
+          <w:rFonts w:ascii="Arial Unicode MS" w:eastAsia="Arial Unicode MS" w:hAnsi="Arial Unicode MS" w:cs="Arial Unicode MS"/>
+        </w:rPr>
+        <w:t>D.A.: Conceptualization, Data curation, Formal analysis, Visualization, Writing – original draft. L.S.: Conceptualization, Methodology, Supervision, Writing – review &amp; editing. D.P.: Methodology, Validation, Writing – review &amp; editing. F.A.: Software, Data curation, Visualization, Writing – review &amp; editing. All authors approved the final version of the manuscript.</w:t>
+      </w:r>
+    </w:p>
+    <w:p>
+      <w:pPr>
+        <w:jc w:val="left"/>
+      </w:pPr>
+      <w:r>
+        <w:rPr>
+          <w:rFonts w:ascii="Arial Unicode MS" w:eastAsia="Arial Unicode MS" w:hAnsi="Arial Unicode MS" w:cs="Arial Unicode MS"/>
+        </w:rPr>
+        <w:t xml:space="preserve"> </w:t>
+      </w:r>
+    </w:p>
+    <w:p>
+      <w:pPr>
+        <w:jc w:val="left"/>
+      </w:pPr>
+      <w:r>
+        <w:rPr>
+          <w:b/>
+          <w:bCs/>
+          <w:i/>
+          <w:iCs/>
+        </w:rPr>
+        <w:t>Competing Interests</w:t>
+      </w:r>
+    </w:p>
+    <w:p>
+      <w:pPr>
+        <w:jc w:val="both"/>
+      </w:pPr>
+      <w:r>
+        <w:rPr>
+          <w:rFonts w:ascii="Arial Unicode MS" w:eastAsia="Arial Unicode MS" w:hAnsi="Arial Unicode MS" w:cs="Arial Unicode MS"/>
+        </w:rPr>
+        <w:t>The authors declare none.</w:t>
+      </w:r>
+    </w:p>
+    <w:p>
+      <w:pPr>
+        <w:jc w:val="left"/>
+      </w:pPr>
+      <w:r>
+        <w:rPr>
+          <w:rFonts w:ascii="Arial Unicode MS" w:eastAsia="Arial Unicode MS" w:hAnsi="Arial Unicode MS" w:cs="Arial Unicode MS"/>
+        </w:rPr>
+        <w:t xml:space="preserve"> </w:t>
+      </w:r>
+    </w:p>
+    <w:p>
+      <w:pPr>
+        <w:jc w:val="left"/>
+      </w:pPr>
+      <w:r>
+        <w:rPr>
+          <w:b/>
+          <w:bCs/>
+          <w:i/>
+          <w:iCs/>
+        </w:rPr>
+        <w:t>Data Availability Statement</w:t>
+      </w:r>
+    </w:p>
+    <w:p>
+      <w:pPr>
+        <w:jc w:val="both"/>
+      </w:pPr>
+      <w:r>
+        <w:rPr>
+          <w:rFonts w:ascii="Arial Unicode MS" w:eastAsia="Arial Unicode MS" w:hAnsi="Arial Unicode MS" w:cs="Arial Unicode MS"/>
+        </w:rPr>
+        <w:t>The data analyzed in this study come from the fifth wave of the Indonesian Family Life Survey (IFLS5), which is publicly available from the RAND Corporation (https://www.rand.org/well-being/social-and-behavioral-policy/data/FLS/IFLS/ifls5.html). The analysis code that reproduces the reported results is available at https://github.com/dndyzz/ifls5_risk_preference.</w:t>
+      </w:r>
+    </w:p>
+    <w:p>
+      <w:pPr>
+        <w:jc w:val="left"/>
+      </w:pPr>
+      <w:r>
+        <w:rPr>
+          <w:rFonts w:ascii="Arial Unicode MS" w:eastAsia="Arial Unicode MS" w:hAnsi="Arial Unicode MS" w:cs="Arial Unicode MS"/>
+        </w:rPr>
+        <w:t xml:space="preserve"> </w:t>
+      </w:r>
+    </w:p>
+    <w:p>
+      <w:pPr>
+        <w:jc w:val="left"/>
+      </w:pPr>
+      <w:r>
+        <w:rPr>
+          <w:b/>
+          <w:bCs/>
+          <w:i/>
+          <w:iCs/>
+        </w:rPr>
+        <w:t>Financial Support</w:t>
+      </w:r>
+    </w:p>
+    <w:p>
+      <w:pPr>
+        <w:jc w:val="both"/>
+      </w:pPr>
+      <w:r>
+        <w:rPr>
+          <w:rFonts w:ascii="Arial Unicode MS" w:eastAsia="Arial Unicode MS" w:hAnsi="Arial Unicode MS" w:cs="Arial Unicode MS"/>
+        </w:rPr>
+        <w:t>This research received no specific grant from any funding agency, commercial or not-for-profit sectors.</w:t>
+      </w:r>
+    </w:p>
+    <w:p>
+      <w:pPr>
+        <w:jc w:val="left"/>
+      </w:pPr>
+      <w:r>
+        <w:rPr>
+          <w:rFonts w:ascii="Arial Unicode MS" w:eastAsia="Arial Unicode MS" w:hAnsi="Arial Unicode MS" w:cs="Arial Unicode MS"/>
+        </w:rPr>
         <w:t xml:space="preserve"> </w:t>
       </w:r>
     </w:p>

</xml_diff>

<commit_message>
docs: fix reference consistency
Cite Eckel & Grossman (2002) alongside their 2008 paper in the gender
paragraph, and remove the uncited Binswanger (1980) entry. Reference list
now contains only cited works (43 entries); two-way citation check passes.

Co-Authored-By: Claude Opus 4.8 <noreply@anthropic.com>
</commit_message>
<xml_diff>
--- a/docs/Risk_Preference_Draft.docx
+++ b/docs/Risk_Preference_Draft.docx
@@ -254,7 +254,7 @@
         <w:jc w:val="both"/>
       </w:pPr>
       <w:r>
-        <w:t>Many studies have documented demographic correlates of risk preferences. Gender differences are among the most robust: women consistently show greater risk aversion across cultures, elicitation methods, and decision domains (Charness &amp; Gneezy, 2012; Croson &amp; Gneezy, 2009; Eckel &amp; Grossman, 2008). Age effects are less clear-cut, with evidence pointing to an inverted-U pattern in which risk tolerance rises into middle adulthood before declining (Dohmen et al., 2017; Josef et al., 2016). Income, education, and wealth have also been linked to risk attitudes, though the direction of causality remains debated (Tanaka et al., 2010). Even so, observable socioeconomic variables typically explain only a modest fraction of the total variance in stated risk preferences, often between 1% and 5% in large population samples (Beauchamp et al., 2017; Dohmen et al., 2011).</w:t>
+        <w:t>Many studies have documented demographic correlates of risk preferences. Gender differences are among the most robust: women consistently show greater risk aversion across cultures, elicitation methods, and decision domains (Charness &amp; Gneezy, 2012; Croson &amp; Gneezy, 2009; Eckel &amp; Grossman, 2002, 2008). Age effects are less clear-cut, with evidence pointing to an inverted-U pattern in which risk tolerance rises into middle adulthood before declining (Dohmen et al., 2017; Josef et al., 2016). Income, education, and wealth have also been linked to risk attitudes, though the direction of causality remains debated (Tanaka et al., 2010). Even so, observable socioeconomic variables typically explain only a modest fraction of the total variance in stated risk preferences, often between 1% and 5% in large population samples (Beauchamp et al., 2017; Dohmen et al., 2011).</w:t>
       </w:r>
     </w:p>
     <w:p>
@@ -18494,23 +18494,6 @@
       </w:r>
       <w:r>
         <w:t>1255. https://doi.org/10.1111/jeea.12055</w:t>
-      </w:r>
-    </w:p>
-    <w:p>
-      <w:pPr>
-        <w:spacing w:after="80" w:line="480" w:lineRule="auto"/>
-        <w:ind w:left="1440" w:hanging="720"/>
-        <w:jc w:val="both"/>
-      </w:pPr>
-      <w:r>
-        <w:lastRenderedPageBreak/>
-        <w:t>Binswanger, H. P. (1980). Attitudes toward risk: Experimental measurement in rural India. American Journal of Agricultural Economics, 62(3), 395</w:t>
-      </w:r>
-      <w:r>
-        <w:t>-</w:t>
-      </w:r>
-      <w:r>
-        <w:t>407. https://doi.org/10.2307/1240194</w:t>
       </w:r>
     </w:p>
     <w:p>

</xml_diff>

<commit_message>
Prepare public release: corrected betas, BFI item labels, figures, README
- Recompute OLS standardized betas as fully standardized (b x SDx/SDy) in
  05_Baseline_Model.Rmd, matching the 5-group robustness method; manuscript
  tables, abstract, and discussion updated (gender attenuation was a scaling
  artifact: beta -0.10 vs -0.09, not -0.25 vs -0.09)
- Fix BFI-15 item labels to match the IFLS5 codebook: PSN_04r = reserved (E),
  PSN_07 = worries a lot (N), PSN_08 = active imagination (O),
  PSN_09r = lazy, reversed (C); pipeline mapping was already correct
- APA 7 italics for all 44 references; add marginaleffects citation
- Publication figures (300-dpi PNG + vector PDF) via new scripts/07_figures.R
- Add README (data access, pipeline order, environment)
- Untrack RStudio state and unused placeholder stubs; ignore model objects
  (they embed individual-level IFLS data); rename 03_cognitve -> 03_cognitive

Co-Authored-By: Claude Fable 5 <noreply@anthropic.com>
</commit_message>
<xml_diff>
--- a/docs/Risk_Preference_Draft.docx
+++ b/docs/Risk_Preference_Draft.docx
@@ -168,20 +168,20 @@
         <w:rPr>
           <w:rFonts w:ascii="Arial Unicode MS" w:eastAsia="Arial Unicode MS" w:hAnsi="Arial Unicode MS" w:cs="Arial Unicode MS"/>
         </w:rPr>
-        <w:t xml:space="preserve">.44). Gender was the single strongest predictor (β = −0.25, </w:t>
+        <w:t xml:space="preserve">.44). Gender was the single strongest predictor (β = −0.10, p &lt; .001)</w:t>
       </w:r>
       <w:r>
         <w:rPr>
           <w:rFonts w:ascii="Arial Unicode MS" w:eastAsia="Arial Unicode MS" w:hAnsi="Arial Unicode MS" w:cs="Arial Unicode MS"/>
           <w:i/>
         </w:rPr>
-        <w:t>p</w:t>
+        <w:t xml:space="preserve"/>
       </w:r>
       <w:r>
         <w:rPr>
           <w:rFonts w:ascii="Arial Unicode MS" w:eastAsia="Arial Unicode MS" w:hAnsi="Arial Unicode MS" w:cs="Arial Unicode MS"/>
         </w:rPr>
-        <w:t xml:space="preserve"> &lt; .001), with women showing substantially greater risk aversion. The full model explained 1.7% of the variance, in line with established limits on predicting stated risk preferences from observable characteristics. A robustness check that reintroduced gamble-averse respondents (</w:t>
+        <w:t xml:space="preserve">, with women showing substantially greater risk aversion. The full model explained 1.7% of the variance, in line with established limits on predicting stated risk preferences from observable characteristics. A robustness check that reintroduced gamble-averse respondents (</w:t>
       </w:r>
       <w:r>
         <w:rPr>
@@ -454,7 +454,7 @@
         <w:t>SD</w:t>
       </w:r>
       <w:r>
-        <w:t xml:space="preserve"> = 11.7). Respondents came from 24 provinces, with the largest concentrations in Central Java (13.4%), West Java (12.7%), and East Java (11.7%). About 37.8% lived in rural areas and 65.3% were employed.</w:t>
+        <w:t xml:space="preserve"> = 11.7). Although the IFLS5 sampling frame covers 13 provinces, the survey tracks and interviews panel members who move, so respondents resided in 24 provinces at the time of interview; the largest concentrations were in Central Java (13.4%), West Java (12.7%), and East Java (11.7%). About 37.8% lived in rural areas and 65.3% were employed.</w:t>
       </w:r>
     </w:p>
     <w:p>
@@ -546,7 +546,7 @@
         <w:t>strongly agree</w:t>
       </w:r>
       <w:r>
-        <w:t>). Four items required reverse coding: PSN_04r (Agreeableness), PSN_05r and PSN_09r (Neuroticism), and PSN_14r (Conscientiousness). The instrument was drawn from the same version used in the German Socio-Economic Panel (Gerlitz &amp; Schupp, 2005). Internal consistency was poor across all five scales: Cronbach’s α ranged from .28 (Agreeableness) to .44 (Openness), with standardized α between .27 (Neuroticism) and .45 (Openness). These values are consistent with published findings for ultra-short personality instruments in non-Western survey contexts (Rammstedt &amp; John, 2007). Both trait composite scores (mean of three items per dimension) and individual item responses were retained for analysis, given the low reliability of composites.</w:t>
+        <w:t xml:space="preserve">). Four items required reverse coding: PSN_04r (Extraversion), PSN_05r (Neuroticism), PSN_09r (Conscientiousness), and PSN_14r (Agreeableness). The instrument was drawn from the same version used in the German Socio-Economic Panel (Gerlitz &amp; Schupp, 2005). Internal consistency was poor across all five scales: Cronbach’s α ranged from .28 (Agreeableness) to .44 (Openness), with standardized α between .27 (Neuroticism) and .45 (Openness). These values are consistent with published findings for ultra-short personality instruments in non-Western survey contexts (Rammstedt &amp; John, 2007). Both trait composite scores (mean of three items per dimension) and individual item responses were retained for analysis, given the low reliability of composites.</w:t>
       </w:r>
     </w:p>
     <w:p>
@@ -624,7 +624,7 @@
         <w:jc w:val="both"/>
       </w:pPr>
       <w:r>
-        <w:t>Five nested model specifications were estimated using ordered logistic regression (proportional odds model; McCullagh, 1980) to assess the incremental predictive value of each variable set: (1) demographics only, (2) trait composites plus demographics, (3) individual personality items plus demographics, (4) cognitive variables plus demographics, and (5) the full model combining individual personality items, cognitive measures, and demographics. Model comparisons were based on the Akaike Information Criterion (AIC; Burnham &amp; Anderson, 2002). Ordinary least squares regression was fitted in parallel to the full specification to obtain standardized coefficients (β) for effect size interpretation. Average marginal effects (AMEs) were computed from the ordered logit to quantify the probability shift associated with each predictor across outcome categories. As a robustness check, all five specifications were re-estimated using the five-group index that included gamble-averse respondents as Group 0. All analyses were conducted in R 4.3 using the MASS package (Venables &amp; Ripley, 2002) for ordered logistic regression and the margins package for AME computation.</w:t>
+        <w:t xml:space="preserve">Five nested model specifications were estimated using ordered logistic regression (proportional odds model; McCullagh, 1980) to assess the incremental predictive value of each variable set: (1) demographics only, (2) trait composites plus demographics, (3) individual personality items plus demographics, (4) cognitive variables plus demographics, and (5) the full model combining individual personality items, cognitive measures, and demographics. Model comparisons were based on the Akaike Information Criterion (AIC; Burnham &amp; Anderson, 2002). Ordinary least squares regression was fitted in parallel to the full specification to obtain fully standardized coefficients (β, computed as b × SDx/SDy for every predictor) for effect size interpretation. Average marginal effects (AMEs) were computed from the ordered logit to quantify the probability shift associated with each predictor across outcome categories. As a robustness check, all five specifications were re-estimated using the five-group index that included gamble-averse respondents as Group 0. All analyses were conducted in R 4.5.2 using the MASS package (Venables &amp; Ripley, 2002) for ordered logistic regression and the marginaleffects package (Arel-Bundock et al., 2024) for AME computation.</w:t>
       </w:r>
     </w:p>
     <w:p>
@@ -6197,7 +6197,7 @@
                 <w:sz w:val="18"/>
                 <w:szCs w:val="18"/>
               </w:rPr>
-              <w:t>12</w:t>
+              <w:t>15</w:t>
             </w:r>
           </w:p>
         </w:tc>
@@ -6372,7 +6372,7 @@
                 <w:sz w:val="18"/>
                 <w:szCs w:val="18"/>
               </w:rPr>
-              <w:t>22</w:t>
+              <w:t>24</w:t>
             </w:r>
           </w:p>
         </w:tc>
@@ -6547,7 +6547,7 @@
                 <w:sz w:val="18"/>
                 <w:szCs w:val="18"/>
               </w:rPr>
-              <w:t>12</w:t>
+              <w:t>14</w:t>
             </w:r>
           </w:p>
         </w:tc>
@@ -6750,7 +6750,7 @@
           <w:sz w:val="20"/>
           <w:szCs w:val="20"/>
         </w:rPr>
-        <w:t>ΔAIC = difference from best-fitting model. k = estimated parameters excluding three threshold parameters.</w:t>
+        <w:t>ΔAIC = difference from best-fitting model. k = number of estimated parameters, including threshold parameters (three in the four-group specification).</w:t>
       </w:r>
     </w:p>
     <w:p>
@@ -7435,7 +7435,7 @@
                 <w:sz w:val="18"/>
                 <w:szCs w:val="18"/>
               </w:rPr>
-              <w:t>−0.249</w:t>
+              <w:t>−0.101</w:t>
             </w:r>
           </w:p>
         </w:tc>
@@ -7679,7 +7679,7 @@
                 <w:sz w:val="18"/>
                 <w:szCs w:val="18"/>
               </w:rPr>
-              <w:t>0.041</w:t>
+              <w:t>0.016</w:t>
             </w:r>
           </w:p>
         </w:tc>
@@ -7922,7 +7922,7 @@
                 <w:sz w:val="18"/>
                 <w:szCs w:val="18"/>
               </w:rPr>
-              <w:t>0.002</w:t>
+              <w:t>0.018</w:t>
             </w:r>
           </w:p>
         </w:tc>
@@ -8166,7 +8166,7 @@
                 <w:sz w:val="18"/>
                 <w:szCs w:val="18"/>
               </w:rPr>
-              <w:t>−0.000</w:t>
+              <w:t>−0.018</w:t>
             </w:r>
           </w:p>
         </w:tc>
@@ -8411,7 +8411,7 @@
                 <w:sz w:val="18"/>
                 <w:szCs w:val="18"/>
               </w:rPr>
-              <w:t>−0.005</w:t>
+              <w:t>−0.004</w:t>
             </w:r>
           </w:p>
         </w:tc>
@@ -8648,7 +8648,7 @@
                 <w:sz w:val="18"/>
                 <w:szCs w:val="18"/>
               </w:rPr>
-              <w:t>−0.010</w:t>
+              <w:t>−0.004</w:t>
             </w:r>
           </w:p>
         </w:tc>
@@ -9087,7 +9087,7 @@
                 <w:sz w:val="18"/>
                 <w:szCs w:val="18"/>
               </w:rPr>
-              <w:t>−0.033</w:t>
+              <w:t>−0.026</w:t>
             </w:r>
           </w:p>
         </w:tc>
@@ -9332,7 +9332,7 @@
                 <w:sz w:val="18"/>
                 <w:szCs w:val="18"/>
               </w:rPr>
-              <w:t>−0.028</w:t>
+              <w:t>−0.023</w:t>
             </w:r>
           </w:p>
         </w:tc>
@@ -9576,7 +9576,7 @@
                 <w:sz w:val="18"/>
                 <w:szCs w:val="18"/>
               </w:rPr>
-              <w:t>0.025</w:t>
+              <w:t>0.020</w:t>
             </w:r>
           </w:p>
         </w:tc>
@@ -9819,7 +9819,7 @@
                 <w:sz w:val="18"/>
                 <w:szCs w:val="18"/>
               </w:rPr>
-              <w:t>−0.023</w:t>
+              <w:t>−0.019</w:t>
             </w:r>
           </w:p>
         </w:tc>
@@ -10065,7 +10065,7 @@
                 <w:sz w:val="18"/>
                 <w:szCs w:val="18"/>
               </w:rPr>
-              <w:t>−0.016</w:t>
+              <w:t>−0.013</w:t>
             </w:r>
           </w:p>
         </w:tc>
@@ -10469,7 +10469,7 @@
                 <w:sz w:val="18"/>
                 <w:szCs w:val="18"/>
               </w:rPr>
-              <w:t>PSN_09r (calm/stress, rev.)</w:t>
+              <w:t xml:space="preserve">PSN_09r (lazy, rev.)</w:t>
             </w:r>
           </w:p>
         </w:tc>
@@ -10504,7 +10504,7 @@
                 <w:sz w:val="18"/>
                 <w:szCs w:val="18"/>
               </w:rPr>
-              <w:t>−0.037</w:t>
+              <w:t>−0.030</w:t>
             </w:r>
           </w:p>
         </w:tc>
@@ -10714,7 +10714,7 @@
                 <w:sz w:val="18"/>
                 <w:szCs w:val="18"/>
               </w:rPr>
-              <w:t>PSN_04r (quarrelsome, rev.)</w:t>
+              <w:t xml:space="preserve">PSN_04r (reserved, rev.)</w:t>
             </w:r>
           </w:p>
         </w:tc>
@@ -10749,7 +10749,7 @@
                 <w:sz w:val="18"/>
                 <w:szCs w:val="18"/>
               </w:rPr>
-              <w:t>−0.024</w:t>
+              <w:t>−0.020</w:t>
             </w:r>
           </w:p>
         </w:tc>
@@ -10993,7 +10993,7 @@
                 <w:sz w:val="18"/>
                 <w:szCs w:val="18"/>
               </w:rPr>
-              <w:t>0.019</w:t>
+              <w:t>0.015</w:t>
             </w:r>
           </w:p>
         </w:tc>
@@ -11202,7 +11202,7 @@
                 <w:sz w:val="18"/>
                 <w:szCs w:val="18"/>
               </w:rPr>
-              <w:t>PSN_07 (active imagination)</w:t>
+              <w:t xml:space="preserve">PSN_07 (worries a lot)</w:t>
             </w:r>
           </w:p>
         </w:tc>
@@ -11237,7 +11237,7 @@
                 <w:sz w:val="18"/>
                 <w:szCs w:val="18"/>
               </w:rPr>
-              <w:t>−0.019</w:t>
+              <w:t>−0.015</w:t>
             </w:r>
           </w:p>
         </w:tc>
@@ -11447,7 +11447,7 @@
                 <w:sz w:val="18"/>
                 <w:szCs w:val="18"/>
               </w:rPr>
-              <w:t>PSN_08 (thorough)</w:t>
+              <w:t xml:space="preserve">PSN_08 (active imagination)</w:t>
             </w:r>
           </w:p>
         </w:tc>
@@ -11481,7 +11481,7 @@
                 <w:sz w:val="18"/>
                 <w:szCs w:val="18"/>
               </w:rPr>
-              <w:t>0.018</w:t>
+              <w:t>0.015</w:t>
             </w:r>
           </w:p>
         </w:tc>
@@ -11681,7 +11681,7 @@
           <w:sz w:val="20"/>
           <w:szCs w:val="20"/>
         </w:rPr>
-        <w:t>Positive β = more risk seeking. “rev.” = reverse-coded. Only |β| ≥ .015 shown; 9 personality items omitted (|β| &lt; .015, p &gt; .14). *** p &lt; .001, ** p &lt; .01, * p &lt; .05, † p &lt; .10.</w:t>
+        <w:t xml:space="preserve">Positive β = more risk seeking. “rev.” = reverse-coded. Only |β| ≥ .014 shown; 10 personality items omitted (|β| &lt; .014, p &gt; .10). *** p &lt; .001, ** p &lt; .01, * p &lt; .05, † p &lt; .10.</w:t>
       </w:r>
     </w:p>
     <w:p>
@@ -11694,7 +11694,7 @@
         <w:rPr>
           <w:rFonts w:ascii="Arial Unicode MS" w:eastAsia="Arial Unicode MS" w:hAnsi="Arial Unicode MS" w:cs="Arial Unicode MS"/>
         </w:rPr>
-        <w:t>Gender was the dominant predictor (β = −0.25, p &lt; .001). The average marginal effect indicated that being female increased the probability of Group 1 by 8.5 percentage points, with a 7.4-point reduction for Group 4. Employment showed a marginal positive association (β = 0.04, p = .064), and age followed a weakly significant inverted-U (quadratic p = .042).</w:t>
+        <w:t xml:space="preserve">Gender was the dominant predictor (β = −0.10, p &lt; .001). The average marginal effect indicated that being female increased the probability of Group 1 by 8.5 percentage points, with a 7.4-point reduction for Group 4. Employment showed a marginal positive association (β = 0.02, p = .064), and age followed a weakly significant inverted-U (quadratic p = .042).</w:t>
       </w:r>
     </w:p>
     <w:p>
@@ -11707,7 +11707,7 @@
         <w:rPr>
           <w:rFonts w:ascii="Arial Unicode MS" w:eastAsia="Arial Unicode MS" w:hAnsi="Arial Unicode MS" w:cs="Arial Unicode MS"/>
         </w:rPr>
-        <w:t>Among the cognitive measures, the number series W-score (β = −0.03, p = .003) and immediate word recall (β = −0.03, p = .048) were significantly and negatively associated with the risk index, so higher cognitive ability went with greater risk aversion. Self-rated memory ran the other way and was positively associated with risk seeking (β = 0.03, p = .008). At the item level, PSN_09r (β = −0.04, p &lt; .001) and PSN_04r (β = −0.02, p = .016) reached significance, and no personality item exceeded any cognitive variable. Figure 2 plots these coefficients by domain.</w:t>
+        <w:t xml:space="preserve">Among the cognitive measures, the number series W-score (β = −0.03, p = .003) and immediate word recall (β = −0.02, p = .048) were significantly and negatively associated with the risk index, so higher cognitive ability went with greater risk aversion. Self-rated memory ran the other way and was positively associated with risk seeking (β = 0.02, p = .008). At the item level, PSN_09r (β = −0.03, p &lt; .001) and PSN_04r (β = −0.02, p = .016) reached significance, and PSN_09r was the only personality item comparable in magnitude to the strongest cognitive predictors. Figure 2 plots these coefficients by domain.</w:t>
       </w:r>
     </w:p>
     <w:p>
@@ -14119,7 +14119,7 @@
                 <w:sz w:val="18"/>
                 <w:szCs w:val="18"/>
               </w:rPr>
-              <w:t>30</w:t>
+              <w:t>31</w:t>
             </w:r>
           </w:p>
         </w:tc>
@@ -14294,7 +14294,7 @@
                 <w:sz w:val="18"/>
                 <w:szCs w:val="18"/>
               </w:rPr>
-              <w:t>12</w:t>
+              <w:t>16</w:t>
             </w:r>
           </w:p>
         </w:tc>
@@ -14469,7 +14469,7 @@
                 <w:sz w:val="18"/>
                 <w:szCs w:val="18"/>
               </w:rPr>
-              <w:t>22</w:t>
+              <w:t>25</w:t>
             </w:r>
           </w:p>
         </w:tc>
@@ -14645,7 +14645,7 @@
                 <w:sz w:val="18"/>
                 <w:szCs w:val="18"/>
               </w:rPr>
-              <w:t>12</w:t>
+              <w:t>15</w:t>
             </w:r>
           </w:p>
         </w:tc>
@@ -14820,7 +14820,7 @@
                 <w:sz w:val="18"/>
                 <w:szCs w:val="18"/>
               </w:rPr>
-              <w:t>9</w:t>
+              <w:t>10</w:t>
             </w:r>
           </w:p>
         </w:tc>
@@ -14862,7 +14862,7 @@
           <w:sz w:val="20"/>
           <w:szCs w:val="20"/>
         </w:rPr>
-        <w:t>4 = as in primary. N = 25,040.</w:t>
+        <w:t xml:space="preserve">4 = as in primary. N = 25,040. k = number of estimated parameters, including four threshold parameters.</w:t>
       </w:r>
     </w:p>
     <w:p>
@@ -15251,7 +15251,7 @@
                 <w:sz w:val="18"/>
                 <w:szCs w:val="18"/>
               </w:rPr>
-              <w:t>−0.249</w:t>
+              <w:t>−0.101</w:t>
             </w:r>
           </w:p>
         </w:tc>
@@ -15461,7 +15461,7 @@
                 <w:sz w:val="18"/>
                 <w:szCs w:val="18"/>
               </w:rPr>
-              <w:t>−0.005</w:t>
+              <w:t>−0.004</w:t>
             </w:r>
           </w:p>
         </w:tc>
@@ -15670,7 +15670,7 @@
                 <w:sz w:val="18"/>
                 <w:szCs w:val="18"/>
               </w:rPr>
-              <w:t>−0.023</w:t>
+              <w:t>−0.019</w:t>
             </w:r>
           </w:p>
         </w:tc>
@@ -15879,7 +15879,7 @@
                 <w:sz w:val="18"/>
                 <w:szCs w:val="18"/>
               </w:rPr>
-              <w:t>−0.033</w:t>
+              <w:t>−0.026</w:t>
             </w:r>
           </w:p>
         </w:tc>
@@ -16088,7 +16088,7 @@
                 <w:sz w:val="18"/>
                 <w:szCs w:val="18"/>
               </w:rPr>
-              <w:t>−0.016</w:t>
+              <w:t>−0.013</w:t>
             </w:r>
           </w:p>
         </w:tc>
@@ -16297,7 +16297,7 @@
                 <w:sz w:val="18"/>
                 <w:szCs w:val="18"/>
               </w:rPr>
-              <w:t>−0.028</w:t>
+              <w:t>−0.023</w:t>
             </w:r>
           </w:p>
         </w:tc>
@@ -16505,7 +16505,7 @@
                 <w:sz w:val="18"/>
                 <w:szCs w:val="18"/>
               </w:rPr>
-              <w:t>0.025</w:t>
+              <w:t>0.020</w:t>
             </w:r>
           </w:p>
         </w:tc>
@@ -16680,7 +16680,7 @@
                 <w:sz w:val="18"/>
                 <w:szCs w:val="18"/>
               </w:rPr>
-              <w:t>PSN_09r (neuroticism)</w:t>
+              <w:t xml:space="preserve">PSN_09r (conscientiousness)</w:t>
             </w:r>
           </w:p>
         </w:tc>
@@ -16715,7 +16715,7 @@
                 <w:sz w:val="18"/>
                 <w:szCs w:val="18"/>
               </w:rPr>
-              <w:t>−0.037</w:t>
+              <w:t>−0.030</w:t>
             </w:r>
           </w:p>
         </w:tc>
@@ -16890,7 +16890,7 @@
                 <w:sz w:val="18"/>
                 <w:szCs w:val="18"/>
               </w:rPr>
-              <w:t>PSN_04r (agreeableness)</w:t>
+              <w:t xml:space="preserve">PSN_04r (extraversion)</w:t>
             </w:r>
           </w:p>
         </w:tc>
@@ -16925,7 +16925,7 @@
                 <w:sz w:val="18"/>
                 <w:szCs w:val="18"/>
               </w:rPr>
-              <w:t>−0.024</w:t>
+              <w:t>−0.020</w:t>
             </w:r>
           </w:p>
         </w:tc>
@@ -17100,7 +17100,7 @@
                 <w:sz w:val="18"/>
                 <w:szCs w:val="18"/>
               </w:rPr>
-              <w:t>PSN_08 (conscient.)</w:t>
+              <w:t xml:space="preserve">PSN_08 (openness)</w:t>
             </w:r>
           </w:p>
         </w:tc>
@@ -17134,7 +17134,7 @@
                 <w:sz w:val="18"/>
                 <w:szCs w:val="18"/>
               </w:rPr>
-              <w:t>0.018</w:t>
+              <w:t>0.015</w:t>
             </w:r>
           </w:p>
         </w:tc>
@@ -17344,7 +17344,7 @@
                 <w:sz w:val="18"/>
                 <w:szCs w:val="18"/>
               </w:rPr>
-              <w:t>−0.010</w:t>
+              <w:t>−0.004</w:t>
             </w:r>
           </w:p>
         </w:tc>
@@ -17554,7 +17554,7 @@
                 <w:sz w:val="18"/>
                 <w:szCs w:val="18"/>
               </w:rPr>
-              <w:t>−0.000</w:t>
+              <w:t>−0.018</w:t>
             </w:r>
           </w:p>
         </w:tc>
@@ -17911,19 +17911,19 @@
         <w:rPr>
           <w:rFonts w:ascii="Arial Unicode MS" w:eastAsia="Arial Unicode MS" w:hAnsi="Arial Unicode MS" w:cs="Arial Unicode MS"/>
         </w:rPr>
-        <w:t>Third, the gender effect attenuated from β = −0.25 to β = −0.09. Women are overrepresented in the gamble-averse category, so part of the gender</w:t>
+        <w:t xml:space="preserve">Third, the gender effect attenuated only modestly, from β = −0.10 to β = −0.09. Although women are overrepresented in the gamble-averse category, the standardized gender coefficient was largely stable across specifications. The gender-risk aversion association therefore appears to reflect a genuine preference difference rather than differential task comprehension.</w:t>
       </w:r>
       <w:r>
         <w:rPr>
           <w:rFonts w:ascii="Arial Unicode MS" w:eastAsia="Arial Unicode MS" w:hAnsi="Arial Unicode MS" w:cs="Arial Unicode MS"/>
         </w:rPr>
-        <w:t>-</w:t>
+        <w:t xml:space="preserve"/>
       </w:r>
       <w:r>
         <w:rPr>
           <w:rFonts w:ascii="Arial Unicode MS" w:eastAsia="Arial Unicode MS" w:hAnsi="Arial Unicode MS" w:cs="Arial Unicode MS"/>
         </w:rPr>
-        <w:t>risk aversion association in the four-group model reflects a genuine preference difference, while part of the expanded effect in the primary analysis reflects the removal of a group that was disproportionately female. The five-group estimate may understate the true gender effect on risk preference by conflating preference with comprehension.</w:t>
+        <w:t xml:space="preserve"/>
       </w:r>
     </w:p>
     <w:p>
@@ -18048,11 +18048,11 @@
         <w:t>reversed direction entirely</w:t>
       </w:r>
       <w:r>
-        <w:t xml:space="preserve">: Raven’s matrices shifted from β = −0.023 to β = +0.031, the number series W-score from −0.033 to </w:t>
+        <w:t xml:space="preserve">: Raven’s matrices shifted from β = −0.019 to β = +0.031, the number series W-score from −0.026 to +0.017</w:t>
       </w:r>
       <w:r>
         <w:lastRenderedPageBreak/>
-        <w:t xml:space="preserve">+0.017, and education from nonsignificant to β = +0.051 (p &lt; .001). The reason is straightforward. Gamble-averse respondents chose the dominated option in the screening gamble and confirmed it, a pattern more consistent with a failure to comprehend the task than with extreme risk aversion. They also tend to have lower cognitive ability and less education. When they anchor the bottom of the ordinal scale, cognitive measures appear to predict risk seeking only because they predict staying out of the dominated-choice category. In the four-group specification, where this comprehension-related variance is gone, the remaining cognitive effect reflects a different process: deliberate evaluation of lottery payoffs among respondents who </w:t>
+        <w:t xml:space="preserve">, and education from nonsignificant to β = +0.051 (p &lt; .001). The reason is straightforward. Gamble-averse respondents chose the dominated option in the screening gamble and confirmed it, a pattern more consistent with a failure to comprehend the task than with extreme risk aversion. They also tend to have lower cognitive ability and less education. When they anchor the bottom of the ordinal scale, cognitive measures appear to predict risk seeking only because they predict staying out of the dominated-choice category. In the four-group specification, where this comprehension-related variance is gone, the remaining cognitive effect reflects a different process: deliberate evaluation of lottery payoffs among respondents who </w:t>
       </w:r>
       <w:r>
         <w:rPr>
@@ -18080,7 +18080,7 @@
         <w:rPr>
           <w:rFonts w:ascii="Arial Unicode MS" w:eastAsia="Arial Unicode MS" w:hAnsi="Arial Unicode MS" w:cs="Arial Unicode MS"/>
         </w:rPr>
-        <w:t>A related finding concerns the split between objective and subjective cognitive measures. In the primary analysis, self-rated memory was positively associated with risk seeking (β = 0.03, p = .008), the opposite of every objective cognitive variable. This fits an overconfidence account: people who overestimate their cognitive capacity may also overestimate their ability to handle risky outcomes, so their risk seeking comes from a miscalibrated self-assessment rather than genuine risk tolerance. The effect vanished in the five-group specification (β = −0.002, p = .79), which suggests the overconfidence signal is specific to risk preference and does not carry over to the cognitively distinct task of dominance recognition. The gap between calibrated competence and subjective confidence is worth further study, especially in populations where financial literacy varies widely (Lusardi &amp; Mitchell, 2014).</w:t>
+        <w:t xml:space="preserve">A related finding concerns the split between objective and subjective cognitive measures. In the primary analysis, self-rated memory was positively associated with risk seeking (β = 0.02, p = .008), the opposite of every objective cognitive variable. This fits an overconfidence account: people who overestimate their cognitive capacity may also overestimate their ability to handle risky outcomes, so their risk seeking comes from a miscalibrated self-assessment rather than genuine risk tolerance. The effect vanished in the five-group specification (β = −0.002, p = .79), which suggests the overconfidence signal is specific to risk preference and does not carry over to the cognitively distinct task of dominance recognition. The gap between calibrated competence and subjective confidence is worth further study, especially in populations where financial literacy varies widely (Lusardi &amp; Mitchell, 2014).</w:t>
       </w:r>
     </w:p>
     <w:p>
@@ -18090,11 +18090,11 @@
         <w:jc w:val="both"/>
       </w:pPr>
       <w:r>
-        <w:t xml:space="preserve">The measurement finding, that individual personality items outperformed trait composites, has direct practical implications. The BFI-15 yielded Cronbach’s α between .28 and .44, far below the .70 usually treated as acceptable (Nunnally &amp; Bernstein, 1994). At this level of reliability, aggregation adds noise rather than removing it and blurs the distinct signals that individual items carry. PSN_09r (emotional stability under stress) was the strongest </w:t>
+        <w:t xml:space="preserve">The measurement finding, that individual personality items outperformed trait composites, has direct practical implications. The BFI-15 yielded Cronbach’s α between .28 and .44, far below the .70 usually treated as acceptable (Nunnally &amp; Bernstein, 1994). At this level of reliability, aggregation adds noise rather than removing it and blurs the distinct signals that individual items carry. PSN_09r (reverse-coded laziness, a Conscientiousness indicator) was the strongest personality predictor</w:t>
       </w:r>
       <w:r>
         <w:lastRenderedPageBreak/>
-        <w:t xml:space="preserve">personality predictor precisely because it captures a specific behavioral regularity that gets diluted when combined with two weaker indicators. The robustness check showed that trait composites </w:t>
+        <w:t xml:space="preserve"> precisely because it captures a specific behavioral regularity that gets diluted when combined with two weaker indicators. The robustness check showed that trait composites </w:t>
       </w:r>
       <w:r>
         <w:rPr>
@@ -18125,7 +18125,7 @@
         <w:rPr>
           <w:rFonts w:ascii="Arial Unicode MS" w:eastAsia="Arial Unicode MS" w:hAnsi="Arial Unicode MS" w:cs="Arial Unicode MS"/>
         </w:rPr>
-        <w:t>The gender effect deserves attention both for its size and for what the robustness check shows about its makeup. Women’s greater risk aversion (β = −0.25 in the primary analysis) dwarfed every other predictor and stayed the strongest effect across all specifications. This replicates one of the most consistent findings in the risk preference literature (Charness &amp; Gneezy, 2012; Croson &amp; Gneezy, 2009), here in a Muslim-majority developing country where gender roles and economic participation differ markedly from Western samples. The five-group analysis cut the effect to β = −0.09 and showed that women are overrepresented in the gamble-averse category. The four-group gender gap therefore combines two processes: a genuine preference difference and a difference in comprehension. Whether the comprehension component comes from financial literacy, survey experience, or task engagement cannot be settled with these data, but the result is a caution against reading the full gender gap as a preference effect. For policy design the practical point still holds: targeting financial interventions by gender is likely to help regardless of which mechanism dominates (Nelson, 2015).</w:t>
+        <w:t xml:space="preserve">The gender effect deserves attention both for its size and for what the robustness check shows about its makeup. Women’s greater risk aversion (β = −0.10 in the primary analysis) was more than three times the size of any other predictor and stayed the strongest effect across all specifications. This replicates one of the most consistent findings in the risk preference literature (Charness &amp; Gneezy, 2012; Croson &amp; Gneezy, 2009), here in a Muslim-majority developing country where gender roles and economic participation differ markedly from Western samples. The five-group analysis left the effect essentially unchanged (β = −0.09), even though women are overrepresented in the gamble-averse category. The gender gap in stated risk preference is therefore robust to how gamble-averse respondents are treated and does not appear to be an artifact of differential task comprehension. For policy design the practical point still holds: targeting financial interventions by gender is likely to be effective in this population (Nelson, 2015).</w:t>
       </w:r>
     </w:p>
     <w:p>
@@ -18455,13 +18455,17 @@
         <w:jc w:val="both"/>
       </w:pPr>
       <w:r>
-        <w:t>Beauchamp, J. P., Cesarini, D., &amp; Johannesson, M. (2017). The psychometric and empirical properties of measures of risk preferences. Journal of Risk and Uncertainty, 54(3), 203</w:t>
-      </w:r>
-      <w:r>
-        <w:t>-</w:t>
-      </w:r>
-      <w:r>
-        <w:t>237. https://doi.org/10.1007/s11166-017-9261-3</w:t>
+        <w:t xml:space="preserve">Arel-Bundock, V., Greifer, N., &amp; Heiss, A. (2024). How to interpret statistical models using marginaleffects for R and Python. </w:t>
+      </w:r>
+      <w:r>
+        <w:rPr>
+          <w:i/>
+          <w:iCs/>
+        </w:rPr>
+        <w:t xml:space="preserve">Journal of Statistical Software, 111</w:t>
+      </w:r>
+      <w:r>
+        <w:t xml:space="preserve">(9), 1-32. https://doi.org/10.18637/jss.v111.i09</w:t>
       </w:r>
     </w:p>
     <w:p>
@@ -18471,13 +18475,17 @@
         <w:jc w:val="both"/>
       </w:pPr>
       <w:r>
-        <w:t>Becker, A., Deckers, T., Dohmen, T., Falk, A., &amp; Kosse, F. (2012). The relationship between economic preferences and psychological personality measures. Annual Review of Economics, 4(1), 453</w:t>
-      </w:r>
-      <w:r>
-        <w:t>-</w:t>
-      </w:r>
-      <w:r>
-        <w:t>478. https://doi.org/10.1146/annurev-economics-080511-110922</w:t>
+        <w:t xml:space="preserve">Beauchamp, J. P., Cesarini, D., &amp; Johannesson, M. (2017). The psychometric and empirical properties of measures of risk preferences. </w:t>
+      </w:r>
+      <w:r>
+        <w:rPr>
+          <w:i/>
+          <w:iCs/>
+        </w:rPr>
+        <w:t xml:space="preserve">Journal of Risk and Uncertainty, 54</w:t>
+      </w:r>
+      <w:r>
+        <w:t xml:space="preserve">(3), 203-237. https://doi.org/10.1007/s11166-017-9261-3</w:t>
       </w:r>
     </w:p>
     <w:p>
@@ -18487,13 +18495,17 @@
         <w:jc w:val="both"/>
       </w:pPr>
       <w:r>
-        <w:t>Benjamin, D. J., Brown, S. A., &amp; Shapiro, J. M. (2013). Who is “behavioral”? Cognitive ability and anomalous preferences. Journal of the European Economic Association, 11(6), 1231</w:t>
-      </w:r>
-      <w:r>
-        <w:t>-</w:t>
-      </w:r>
-      <w:r>
-        <w:t>1255. https://doi.org/10.1111/jeea.12055</w:t>
+        <w:t xml:space="preserve">Becker, A., Deckers, T., Dohmen, T., Falk, A., &amp; Kosse, F. (2012). The relationship between economic preferences and psychological personality measures. </w:t>
+      </w:r>
+      <w:r>
+        <w:rPr>
+          <w:i/>
+          <w:iCs/>
+        </w:rPr>
+        <w:t xml:space="preserve">Annual Review of Economics, 4</w:t>
+      </w:r>
+      <w:r>
+        <w:t xml:space="preserve">(1), 453-478. https://doi.org/10.1146/annurev-economics-080511-110922</w:t>
       </w:r>
     </w:p>
     <w:p>
@@ -18503,13 +18515,17 @@
         <w:jc w:val="both"/>
       </w:pPr>
       <w:r>
-        <w:t>Bonin, H., Dohmen, T., Falk, A., Huffman, D., &amp; Sunde, U. (2007). Cross-sectional earnings risk and occupational sorting: The role of risk attitudes. Labour Economics, 14(6), 926</w:t>
-      </w:r>
-      <w:r>
-        <w:t>-</w:t>
-      </w:r>
-      <w:r>
-        <w:t>937. https://doi.org/10.1016/j.labeco.2007.06.007</w:t>
+        <w:t xml:space="preserve">Benjamin, D. J., Brown, S. A., &amp; Shapiro, J. M. (2013). Who is “behavioral”? Cognitive ability and anomalous preferences. </w:t>
+      </w:r>
+      <w:r>
+        <w:rPr>
+          <w:i/>
+          <w:iCs/>
+        </w:rPr>
+        <w:t xml:space="preserve">Journal of the European Economic Association, 11</w:t>
+      </w:r>
+      <w:r>
+        <w:t xml:space="preserve">(6), 1231-1255. https://doi.org/10.1111/jeea.12055</w:t>
       </w:r>
     </w:p>
     <w:p>
@@ -18519,13 +18535,17 @@
         <w:jc w:val="both"/>
       </w:pPr>
       <w:r>
-        <w:t>Borghans, L., Duckworth, A. L., Heckman, J. J., &amp; ter Weel, B. (2008). The economics and psychology of personality traits. Journal of Human Resources, 43(4), 972</w:t>
-      </w:r>
-      <w:r>
-        <w:t>-</w:t>
-      </w:r>
-      <w:r>
-        <w:t>1059. https://doi.org/10.3368/jhr.43.4.972</w:t>
+        <w:t xml:space="preserve">Bonin, H., Dohmen, T., Falk, A., Huffman, D., &amp; Sunde, U. (2007). Cross-sectional earnings risk and occupational sorting: The role of risk attitudes. </w:t>
+      </w:r>
+      <w:r>
+        <w:rPr>
+          <w:i/>
+          <w:iCs/>
+        </w:rPr>
+        <w:t xml:space="preserve">Labour Economics, 14</w:t>
+      </w:r>
+      <w:r>
+        <w:t xml:space="preserve">(6), 926-937. https://doi.org/10.1016/j.labeco.2007.06.007</w:t>
       </w:r>
     </w:p>
     <w:p>
@@ -18535,19 +18555,17 @@
         <w:jc w:val="both"/>
       </w:pPr>
       <w:r>
-        <w:t>Borghans, L., Golsteyn, B. H. H., Heckman, J. J., &amp; Meijers, H. (2009). Gender differences in risk aversion and ambiguity aversion. Journal of the European Economic Association, 7(2</w:t>
-      </w:r>
-      <w:r>
-        <w:t>-</w:t>
-      </w:r>
-      <w:r>
-        <w:t>3), 649</w:t>
-      </w:r>
-      <w:r>
-        <w:t>-</w:t>
-      </w:r>
-      <w:r>
-        <w:t>658. https://doi.org/10.1162/JEEA.2009.7.2-3.649</w:t>
+        <w:t xml:space="preserve">Borghans, L., Duckworth, A. L., Heckman, J. J., &amp; ter Weel, B. (2008). The economics and psychology of personality traits. </w:t>
+      </w:r>
+      <w:r>
+        <w:rPr>
+          <w:i/>
+          <w:iCs/>
+        </w:rPr>
+        <w:t xml:space="preserve">Journal of Human Resources, 43</w:t>
+      </w:r>
+      <w:r>
+        <w:t xml:space="preserve">(4), 972-1059. https://doi.org/10.3368/jhr.43.4.972</w:t>
       </w:r>
     </w:p>
     <w:p>
@@ -18557,13 +18575,17 @@
         <w:jc w:val="both"/>
       </w:pPr>
       <w:r>
-        <w:t>Burks, S. V., Carpenter, J. P., Goette, L., &amp; Rustichini, A. (2009). Cognitive skills affect economic preferences, strategic behavior, and job attachment. Proceedings of the National Academy of Sciences, 106(19), 7745</w:t>
-      </w:r>
-      <w:r>
-        <w:t>-</w:t>
-      </w:r>
-      <w:r>
-        <w:t>7750. https://doi.org/10.1073/pnas.0812360106</w:t>
+        <w:t xml:space="preserve">Borghans, L., Golsteyn, B. H. H., Heckman, J. J., &amp; Meijers, H. (2009). Gender differences in risk aversion and ambiguity aversion. </w:t>
+      </w:r>
+      <w:r>
+        <w:rPr>
+          <w:i/>
+          <w:iCs/>
+        </w:rPr>
+        <w:t xml:space="preserve">Journal of the European Economic Association, 7</w:t>
+      </w:r>
+      <w:r>
+        <w:t xml:space="preserve">(2-3), 649-658. https://doi.org/10.1162/JEEA.2009.7.2-3.649</w:t>
       </w:r>
     </w:p>
     <w:p>
@@ -18573,7 +18595,17 @@
         <w:jc w:val="both"/>
       </w:pPr>
       <w:r>
-        <w:t>Burnham, K. P., &amp; Anderson, D. R. (2002). Model selection and multimodel inference: A practical information-theoretic approach (2nd ed.). Springer.</w:t>
+        <w:t xml:space="preserve">Burks, S. V., Carpenter, J. P., Goette, L., &amp; Rustichini, A. (2009). Cognitive skills affect economic preferences, strategic behavior, and job attachment. </w:t>
+      </w:r>
+      <w:r>
+        <w:rPr>
+          <w:i/>
+          <w:iCs/>
+        </w:rPr>
+        <w:t xml:space="preserve">Proceedings of the National Academy of Sciences, 106</w:t>
+      </w:r>
+      <w:r>
+        <w:t xml:space="preserve">(19), 7745-7750. https://doi.org/10.1073/pnas.0812360106</w:t>
       </w:r>
     </w:p>
     <w:p>
@@ -18583,13 +18615,17 @@
         <w:jc w:val="both"/>
       </w:pPr>
       <w:r>
-        <w:t>Charness, G., &amp; Gneezy, U. (2012). Strong evidence for gender differences in risk taking. Journal of Economic Behavior &amp; Organization, 83(1), 50</w:t>
-      </w:r>
-      <w:r>
-        <w:t>-</w:t>
-      </w:r>
-      <w:r>
-        <w:t>58. https://doi.org/10.1016/j.jebo.2011.06.007</w:t>
+        <w:t xml:space="preserve">Burnham, K. P., &amp; Anderson, D. R. (2002). </w:t>
+      </w:r>
+      <w:r>
+        <w:rPr>
+          <w:i/>
+          <w:iCs/>
+        </w:rPr>
+        <w:t xml:space="preserve">Model selection and multimodel inference: A practical information-theoretic approach</w:t>
+      </w:r>
+      <w:r>
+        <w:t xml:space="preserve"> (2nd ed.). Springer.</w:t>
       </w:r>
     </w:p>
     <w:p>
@@ -18599,13 +18635,17 @@
         <w:jc w:val="both"/>
       </w:pPr>
       <w:r>
-        <w:t>Church, A. T. (2010). Current perspectives in the study of personality across cultures. Perspectives on Psychological Science, 5(4), 441</w:t>
-      </w:r>
-      <w:r>
-        <w:t>-</w:t>
-      </w:r>
-      <w:r>
-        <w:t>449. https://doi.org/10.1177/1745691610375559</w:t>
+        <w:t xml:space="preserve">Charness, G., &amp; Gneezy, U. (2012). Strong evidence for gender differences in risk taking. </w:t>
+      </w:r>
+      <w:r>
+        <w:rPr>
+          <w:i/>
+          <w:iCs/>
+        </w:rPr>
+        <w:t xml:space="preserve">Journal of Economic Behavior &amp; Organization, 83</w:t>
+      </w:r>
+      <w:r>
+        <w:t xml:space="preserve">(1), 50-58. https://doi.org/10.1016/j.jebo.2011.06.007</w:t>
       </w:r>
     </w:p>
     <w:p>
@@ -18615,14 +18655,17 @@
         <w:jc w:val="both"/>
       </w:pPr>
       <w:r>
-        <w:lastRenderedPageBreak/>
-        <w:t>Crimmins, E. M., Kim, J. K., Langa, K. M., &amp; Weir, D. R. (2011). Assessment of cognition using surveys and neuropsychological assessment: The Health and Retirement Study and the Aging, Demographics, and Memory Study. Journals of Gerontology: Series B, 66B(suppl_1), i162</w:t>
-      </w:r>
-      <w:r>
-        <w:t>-</w:t>
-      </w:r>
-      <w:r>
-        <w:t>i171. https://doi.org/10.1093/geronb/gbr048</w:t>
+        <w:t xml:space="preserve">Church, A. T. (2010). Current perspectives in the study of personality across cultures. </w:t>
+      </w:r>
+      <w:r>
+        <w:rPr>
+          <w:i/>
+          <w:iCs/>
+        </w:rPr>
+        <w:t xml:space="preserve">Perspectives on Psychological Science, 5</w:t>
+      </w:r>
+      <w:r>
+        <w:t xml:space="preserve">(4), 441-449. https://doi.org/10.1177/1745691610375559</w:t>
       </w:r>
     </w:p>
     <w:p>
@@ -18632,13 +18675,17 @@
         <w:jc w:val="both"/>
       </w:pPr>
       <w:r>
-        <w:t>Croson, R., &amp; Gneezy, U. (2009). Gender differences in preferences. Journal of Economic Literature, 47(2), 448</w:t>
-      </w:r>
-      <w:r>
-        <w:t>-</w:t>
-      </w:r>
-      <w:r>
-        <w:t>474. https://doi.org/10.1257/jel.47.2.448</w:t>
+        <w:t xml:space="preserve">Crimmins, E. M., Kim, J. K., Langa, K. M., &amp; Weir, D. R. (2011). Assessment of cognition using surveys and neuropsychological assessment: The Health and Retirement Study and the Aging, Demographics, and Memory Study. </w:t>
+      </w:r>
+      <w:r>
+        <w:rPr>
+          <w:i/>
+          <w:iCs/>
+        </w:rPr>
+        <w:t xml:space="preserve">Journals of Gerontology: Series B, 66B</w:t>
+      </w:r>
+      <w:r>
+        <w:t xml:space="preserve">(suppl_1), i162-i171. https://doi.org/10.1093/geronb/gbr048</w:t>
       </w:r>
     </w:p>
     <w:p>
@@ -18648,13 +18695,17 @@
         <w:jc w:val="both"/>
       </w:pPr>
       <w:r>
-        <w:t>Dohmen, T., Falk, A., Huffman, D., &amp; Sunde, U. (2010). Are risk aversion and impatience related to cognitive ability? American Economic Review, 100(3), 1238</w:t>
-      </w:r>
-      <w:r>
-        <w:t>-</w:t>
-      </w:r>
-      <w:r>
-        <w:t>1260. https://doi.org/10.1257/aer.100.3.1238</w:t>
+        <w:t xml:space="preserve">Croson, R., &amp; Gneezy, U. (2009). Gender differences in preferences. </w:t>
+      </w:r>
+      <w:r>
+        <w:rPr>
+          <w:i/>
+          <w:iCs/>
+        </w:rPr>
+        <w:t xml:space="preserve">Journal of Economic Literature, 47</w:t>
+      </w:r>
+      <w:r>
+        <w:t xml:space="preserve">(2), 448-474. https://doi.org/10.1257/jel.47.2.448</w:t>
       </w:r>
     </w:p>
     <w:p>
@@ -18664,13 +18715,17 @@
         <w:jc w:val="both"/>
       </w:pPr>
       <w:r>
-        <w:t>Dohmen, T., Falk, A., Huffman, D., Sunde, U., Schupp, J., &amp; Wagner, G. G. (2011). Individual risk attitudes: Measurement, determinants, and behavioral consequences. Journal of the European Economic Association, 9(3), 522</w:t>
-      </w:r>
-      <w:r>
-        <w:t>-</w:t>
-      </w:r>
-      <w:r>
-        <w:t>550. https://doi.org/10.1111/j.1542-4774.2011.01015.x</w:t>
+        <w:t xml:space="preserve">Dohmen, T., Falk, A., Huffman, D., &amp; Sunde, U. (2010). Are risk aversion and impatience related to cognitive ability? </w:t>
+      </w:r>
+      <w:r>
+        <w:rPr>
+          <w:i/>
+          <w:iCs/>
+        </w:rPr>
+        <w:t xml:space="preserve">American Economic Review, 100</w:t>
+      </w:r>
+      <w:r>
+        <w:t xml:space="preserve">(3), 1238-1260. https://doi.org/10.1257/aer.100.3.1238</w:t>
       </w:r>
     </w:p>
     <w:p>
@@ -18680,13 +18735,17 @@
         <w:jc w:val="both"/>
       </w:pPr>
       <w:r>
-        <w:t>Dohmen, T., Falk, A., Golsteyn, B. H. H., Huffman, D., &amp; Sunde, U. (2017). Risk attitudes across the life course. Economic Journal, 127(605), F95</w:t>
-      </w:r>
-      <w:r>
-        <w:t>-</w:t>
-      </w:r>
-      <w:r>
-        <w:t>F116. https://doi.org/10.1111/ecoj.12322</w:t>
+        <w:t xml:space="preserve">Dohmen, T., Falk, A., Huffman, D., Sunde, U., Schupp, J., &amp; Wagner, G. G. (2011). Individual risk attitudes: Measurement, determinants, and behavioral consequences. </w:t>
+      </w:r>
+      <w:r>
+        <w:rPr>
+          <w:i/>
+          <w:iCs/>
+        </w:rPr>
+        <w:t xml:space="preserve">Journal of the European Economic Association, 9</w:t>
+      </w:r>
+      <w:r>
+        <w:t xml:space="preserve">(3), 522-550. https://doi.org/10.1111/j.1542-4774.2011.01015.x</w:t>
       </w:r>
     </w:p>
     <w:p>
@@ -18696,13 +18755,17 @@
         <w:jc w:val="both"/>
       </w:pPr>
       <w:r>
-        <w:t>Eckel, C. C., &amp; Grossman, P. J. (2002). Sex differences and statistical stereotyping in attitudes toward financial risk. Evolution and Human Behavior, 23(4), 281</w:t>
-      </w:r>
-      <w:r>
-        <w:t>-</w:t>
-      </w:r>
-      <w:r>
-        <w:t>295. https://doi.org/10.1016/S1090-5138(02)00097-1</w:t>
+        <w:t xml:space="preserve">Dohmen, T., Falk, A., Golsteyn, B. H. H., Huffman, D., &amp; Sunde, U. (2017). Risk attitudes across the life course. </w:t>
+      </w:r>
+      <w:r>
+        <w:rPr>
+          <w:i/>
+          <w:iCs/>
+        </w:rPr>
+        <w:t xml:space="preserve">Economic Journal, 127</w:t>
+      </w:r>
+      <w:r>
+        <w:t xml:space="preserve">(605), F95-F116. https://doi.org/10.1111/ecoj.12322</w:t>
       </w:r>
     </w:p>
     <w:p>
@@ -18712,13 +18775,17 @@
         <w:jc w:val="both"/>
       </w:pPr>
       <w:r>
-        <w:t>Eckel, C. C., &amp; Grossman, P. J. (2008). Forecasting risk attitudes: An experimental study using actual and forecast gamble choices. Journal of Economic Behavior &amp; Organization, 68(1), 1</w:t>
-      </w:r>
-      <w:r>
-        <w:t>-</w:t>
-      </w:r>
-      <w:r>
-        <w:t>17. https://doi.org/10.1016/j.jebo.2008.04.006</w:t>
+        <w:t xml:space="preserve">Eckel, C. C., &amp; Grossman, P. J. (2002). Sex differences and statistical stereotyping in attitudes toward financial risk. </w:t>
+      </w:r>
+      <w:r>
+        <w:rPr>
+          <w:i/>
+          <w:iCs/>
+        </w:rPr>
+        <w:t xml:space="preserve">Evolution and Human Behavior, 23</w:t>
+      </w:r>
+      <w:r>
+        <w:t xml:space="preserve">(4), 281-295. https://doi.org/10.1016/S1090-5138(02)00097-1</w:t>
       </w:r>
     </w:p>
     <w:p>
@@ -18728,13 +18795,17 @@
         <w:jc w:val="both"/>
       </w:pPr>
       <w:r>
-        <w:t>Falk, A., Becker, A., Dohmen, T., Enke, B., Huffman, D., &amp; Sunde, U. (2018). Global evidence on economic preferences. Quarterly Journal of Economics, 133(4), 1645</w:t>
-      </w:r>
-      <w:r>
-        <w:t>-</w:t>
-      </w:r>
-      <w:r>
-        <w:t>1692. https://doi.org/10.1093/qje/qjy013</w:t>
+        <w:t xml:space="preserve">Eckel, C. C., &amp; Grossman, P. J. (2008). Forecasting risk attitudes: An experimental study using actual and forecast gamble choices. </w:t>
+      </w:r>
+      <w:r>
+        <w:rPr>
+          <w:i/>
+          <w:iCs/>
+        </w:rPr>
+        <w:t xml:space="preserve">Journal of Economic Behavior &amp; Organization, 68</w:t>
+      </w:r>
+      <w:r>
+        <w:t xml:space="preserve">(1), 1-17. https://doi.org/10.1016/j.jebo.2008.04.006</w:t>
       </w:r>
     </w:p>
     <w:p>
@@ -18744,14 +18815,17 @@
         <w:jc w:val="both"/>
       </w:pPr>
       <w:r>
-        <w:lastRenderedPageBreak/>
-        <w:t>Frederick, S. (2005). Cognitive reflection and decision making. Journal of Economic Perspectives, 19(4), 25</w:t>
-      </w:r>
-      <w:r>
-        <w:t>-</w:t>
-      </w:r>
-      <w:r>
-        <w:t>42. https://doi.org/10.1257/089533005775196732</w:t>
+        <w:t xml:space="preserve">Falk, A., Becker, A., Dohmen, T., Enke, B., Huffman, D., &amp; Sunde, U. (2018). Global evidence on economic preferences. </w:t>
+      </w:r>
+      <w:r>
+        <w:rPr>
+          <w:i/>
+          <w:iCs/>
+        </w:rPr>
+        <w:t xml:space="preserve">Quarterly Journal of Economics, 133</w:t>
+      </w:r>
+      <w:r>
+        <w:t xml:space="preserve">(4), 1645-1692. https://doi.org/10.1093/qje/qjy013</w:t>
       </w:r>
     </w:p>
     <w:p>
@@ -18761,7 +18835,17 @@
         <w:jc w:val="both"/>
       </w:pPr>
       <w:r>
-        <w:t>Gerlitz, J.-Y., &amp; Schupp, J. (2005). Zur Erhebung der Big-Five-basierten Persönlichkeitsmerkmale im SOEP [The measurement of the Big Five-based personality traits in the SOEP] (Research Notes No. 4). DIW Berlin.</w:t>
+        <w:t xml:space="preserve">Frederick, S. (2005). Cognitive reflection and decision making. </w:t>
+      </w:r>
+      <w:r>
+        <w:rPr>
+          <w:i/>
+          <w:iCs/>
+        </w:rPr>
+        <w:t xml:space="preserve">Journal of Economic Perspectives, 19</w:t>
+      </w:r>
+      <w:r>
+        <w:t xml:space="preserve">(4), 25-42. https://doi.org/10.1257/089533005775196732</w:t>
       </w:r>
     </w:p>
     <w:p>
@@ -18771,19 +18855,17 @@
         <w:jc w:val="both"/>
       </w:pPr>
       <w:r>
-        <w:t>Henrich, J., Heine, S. J., &amp; Norenzayan, A. (2010). The weirdest people in the world? Behavioral and Brain Sciences, 33(2</w:t>
-      </w:r>
-      <w:r>
-        <w:t>-</w:t>
-      </w:r>
-      <w:r>
-        <w:t>3), 61</w:t>
-      </w:r>
-      <w:r>
-        <w:t>-</w:t>
-      </w:r>
-      <w:r>
-        <w:t>83. https://doi.org/10.1017/S0140525X0999152X</w:t>
+        <w:t xml:space="preserve">Gerlitz, J.-Y., &amp; Schupp, J. (2005). </w:t>
+      </w:r>
+      <w:r>
+        <w:rPr>
+          <w:i/>
+          <w:iCs/>
+        </w:rPr>
+        <w:t xml:space="preserve">Zur Erhebung der Big-Five-basierten Persönlichkeitsmerkmale im SOEP</w:t>
+      </w:r>
+      <w:r>
+        <w:t xml:space="preserve"> [The measurement of the Big Five-based personality traits in the SOEP] (Research Notes No. 4). DIW Berlin.</w:t>
       </w:r>
     </w:p>
     <w:p>
@@ -18793,13 +18875,17 @@
         <w:jc w:val="both"/>
       </w:pPr>
       <w:r>
-        <w:t>Holt, C. A., &amp; Laury, S. K. (2002). Risk aversion and incentive effects. American Economic Review, 92(5), 1644</w:t>
-      </w:r>
-      <w:r>
-        <w:t>-</w:t>
-      </w:r>
-      <w:r>
-        <w:t>1655. https://doi.org/10.1257/000282802762024700</w:t>
+        <w:t xml:space="preserve">Henrich, J., Heine, S. J., &amp; Norenzayan, A. (2010). The weirdest people in the world? </w:t>
+      </w:r>
+      <w:r>
+        <w:rPr>
+          <w:i/>
+          <w:iCs/>
+        </w:rPr>
+        <w:t xml:space="preserve">Behavioral and Brain Sciences, 33</w:t>
+      </w:r>
+      <w:r>
+        <w:t xml:space="preserve">(2-3), 61-83. https://doi.org/10.1017/S0140525X0999152X</w:t>
       </w:r>
     </w:p>
     <w:p>
@@ -18809,13 +18895,17 @@
         <w:jc w:val="both"/>
       </w:pPr>
       <w:r>
-        <w:t>Jaeger, D. A., Dohmen, T., Falk, A., Huffman, D., Sunde, U., &amp; Bonin, H. (2010). Direct evidence on risk attitudes and migration. Review of Economics and Statistics, 92(3), 684</w:t>
-      </w:r>
-      <w:r>
-        <w:t>-</w:t>
-      </w:r>
-      <w:r>
-        <w:t>689. https://doi.org/10.1162/REST_a_00020</w:t>
+        <w:t xml:space="preserve">Holt, C. A., &amp; Laury, S. K. (2002). Risk aversion and incentive effects. </w:t>
+      </w:r>
+      <w:r>
+        <w:rPr>
+          <w:i/>
+          <w:iCs/>
+        </w:rPr>
+        <w:t xml:space="preserve">American Economic Review, 92</w:t>
+      </w:r>
+      <w:r>
+        <w:t xml:space="preserve">(5), 1644-1655. https://doi.org/10.1257/000282802762024700</w:t>
       </w:r>
     </w:p>
     <w:p>
@@ -18825,13 +18915,17 @@
         <w:jc w:val="both"/>
       </w:pPr>
       <w:r>
-        <w:t>John, O. P., Naumann, L. P., &amp; Soto, C. J. (2008). Paradigm shift to the integrative Big Five trait taxonomy. In O. P. John, R. W. Robins, &amp; L. A. Pervin (Eds.), Handbook of personality: Theory and research (3rd ed., pp. 114</w:t>
-      </w:r>
-      <w:r>
-        <w:t>-</w:t>
-      </w:r>
-      <w:r>
-        <w:t>158). Guilford Press.</w:t>
+        <w:t xml:space="preserve">Jaeger, D. A., Dohmen, T., Falk, A., Huffman, D., Sunde, U., &amp; Bonin, H. (2010). Direct evidence on risk attitudes and migration. </w:t>
+      </w:r>
+      <w:r>
+        <w:rPr>
+          <w:i/>
+          <w:iCs/>
+        </w:rPr>
+        <w:t xml:space="preserve">Review of Economics and Statistics, 92</w:t>
+      </w:r>
+      <w:r>
+        <w:t xml:space="preserve">(3), 684-689. https://doi.org/10.1162/REST_a_00020</w:t>
       </w:r>
     </w:p>
     <w:p>
@@ -18841,13 +18935,17 @@
         <w:jc w:val="both"/>
       </w:pPr>
       <w:r>
-        <w:t>Josef, A. K., Richter, D., Samanez-Larkin, G. R., Wagner, G. G., Hertwig, R., &amp; Mata, R. (2016). Stability and change in risk preferences: The role of above/below median shifts. Journal of Personality and Social Psychology, 111(3), 430</w:t>
-      </w:r>
-      <w:r>
-        <w:t>-</w:t>
-      </w:r>
-      <w:r>
-        <w:t>450. https://doi.org/10.1037/pspp0000090</w:t>
+        <w:t xml:space="preserve">John, O. P., Naumann, L. P., &amp; Soto, C. J. (2008). Paradigm shift to the integrative Big Five trait taxonomy. In O. P. John, R. W. Robins, &amp; L. A. Pervin (Eds.), </w:t>
+      </w:r>
+      <w:r>
+        <w:rPr>
+          <w:i/>
+          <w:iCs/>
+        </w:rPr>
+        <w:t xml:space="preserve">Handbook of personality: Theory and research</w:t>
+      </w:r>
+      <w:r>
+        <w:t xml:space="preserve"> (3rd ed., pp. 114-158). Guilford Press.</w:t>
       </w:r>
     </w:p>
     <w:p>
@@ -18857,13 +18955,17 @@
         <w:jc w:val="both"/>
       </w:pPr>
       <w:r>
-        <w:t>Lauriola, M., &amp; Levin, I. P. (2001). Personality traits and risky decision-making in a controlled experimental task. Personality and Individual Differences, 31(2), 215</w:t>
-      </w:r>
-      <w:r>
-        <w:t>-</w:t>
-      </w:r>
-      <w:r>
-        <w:t>226. https://doi.org/10.1016/S0191-8869(00)00130-6</w:t>
+        <w:t xml:space="preserve">Josef, A. K., Richter, D., Samanez-Larkin, G. R., Wagner, G. G., Hertwig, R., &amp; Mata, R. (2016). Stability and change in risk preferences: The role of above/below median shifts. </w:t>
+      </w:r>
+      <w:r>
+        <w:rPr>
+          <w:i/>
+          <w:iCs/>
+        </w:rPr>
+        <w:t xml:space="preserve">Journal of Personality and Social Psychology, 111</w:t>
+      </w:r>
+      <w:r>
+        <w:t xml:space="preserve">(3), 430-450. https://doi.org/10.1037/pspp0000090</w:t>
       </w:r>
     </w:p>
     <w:p>
@@ -18873,14 +18975,17 @@
         <w:jc w:val="both"/>
       </w:pPr>
       <w:r>
-        <w:lastRenderedPageBreak/>
-        <w:t>Lerner, J. S., Li, Y., Valdesolo, P., &amp; Kassam, K. S. (2015). Emotion and decision making. Annual Review of Psychology, 66, 799</w:t>
-      </w:r>
-      <w:r>
-        <w:t>-</w:t>
-      </w:r>
-      <w:r>
-        <w:t>823. https://doi.org/10.1146/annurev-psych-010213-115043</w:t>
+        <w:t xml:space="preserve">Lauriola, M., &amp; Levin, I. P. (2001). Personality traits and risky decision-making in a controlled experimental task. </w:t>
+      </w:r>
+      <w:r>
+        <w:rPr>
+          <w:i/>
+          <w:iCs/>
+        </w:rPr>
+        <w:t xml:space="preserve">Personality and Individual Differences, 31</w:t>
+      </w:r>
+      <w:r>
+        <w:t xml:space="preserve">(2), 215-226. https://doi.org/10.1016/S0191-8869(00)00130-6</w:t>
       </w:r>
     </w:p>
     <w:p>
@@ -18890,13 +18995,17 @@
         <w:jc w:val="both"/>
       </w:pPr>
       <w:r>
-        <w:t>Lusardi, A., &amp; Mitchell, O. S. (2014). The economic importance of financial literacy: Theory and evidence. Journal of Economic Literature, 52(1), 5</w:t>
-      </w:r>
-      <w:r>
-        <w:t>-</w:t>
-      </w:r>
-      <w:r>
-        <w:t>44. https://doi.org/10.1257/jel.52.1.5</w:t>
+        <w:t xml:space="preserve">Lerner, J. S., Li, Y., Valdesolo, P., &amp; Kassam, K. S. (2015). Emotion and decision making. </w:t>
+      </w:r>
+      <w:r>
+        <w:rPr>
+          <w:i/>
+          <w:iCs/>
+        </w:rPr>
+        <w:t xml:space="preserve">Annual Review of Psychology, 66</w:t>
+      </w:r>
+      <w:r>
+        <w:t xml:space="preserve">, 799-823. https://doi.org/10.1146/annurev-psych-010213-115043</w:t>
       </w:r>
     </w:p>
     <w:p>
@@ -18906,13 +19015,17 @@
         <w:jc w:val="both"/>
       </w:pPr>
       <w:r>
-        <w:t>Malmendier, U., &amp; Nagel, S. (2011). Depression babies: Do macroeconomic experiences affect risk taking? Quarterly Journal of Economics, 126(1), 373</w:t>
-      </w:r>
-      <w:r>
-        <w:t>-</w:t>
-      </w:r>
-      <w:r>
-        <w:t>416. https://doi.org/10.1093/qje/qjq004</w:t>
+        <w:t xml:space="preserve">Lusardi, A., &amp; Mitchell, O. S. (2014). The economic importance of financial literacy: Theory and evidence. </w:t>
+      </w:r>
+      <w:r>
+        <w:rPr>
+          <w:i/>
+          <w:iCs/>
+        </w:rPr>
+        <w:t xml:space="preserve">Journal of Economic Literature, 52</w:t>
+      </w:r>
+      <w:r>
+        <w:t xml:space="preserve">(1), 5-44. https://doi.org/10.1257/jel.52.1.5</w:t>
       </w:r>
     </w:p>
     <w:p>
@@ -18922,13 +19035,17 @@
         <w:jc w:val="both"/>
       </w:pPr>
       <w:r>
-        <w:t>McCrae, R. R., &amp; Costa, P. T., Jr. (2008). The five-factor theory of personality. In O. P. John, R. W. Robins, &amp; L. A. Pervin (Eds.), Handbook of personality (3rd ed., pp. 159</w:t>
-      </w:r>
-      <w:r>
-        <w:t>-</w:t>
-      </w:r>
-      <w:r>
-        <w:t>181). Guilford Press.</w:t>
+        <w:t xml:space="preserve">Malmendier, U., &amp; Nagel, S. (2011). Depression babies: Do macroeconomic experiences affect risk taking? </w:t>
+      </w:r>
+      <w:r>
+        <w:rPr>
+          <w:i/>
+          <w:iCs/>
+        </w:rPr>
+        <w:t xml:space="preserve">Quarterly Journal of Economics, 126</w:t>
+      </w:r>
+      <w:r>
+        <w:t xml:space="preserve">(1), 373-416. https://doi.org/10.1093/qje/qjq004</w:t>
       </w:r>
     </w:p>
     <w:p>
@@ -18938,13 +19055,17 @@
         <w:jc w:val="both"/>
       </w:pPr>
       <w:r>
-        <w:t>McCullagh, P. (1980). Regression models for ordinal data. Journal of the Royal Statistical Society: Series B, 42(2), 109</w:t>
-      </w:r>
-      <w:r>
-        <w:t>-</w:t>
-      </w:r>
-      <w:r>
-        <w:t>142. https://doi.org/10.1111/j.2517-6161.1980.tb01109.x</w:t>
+        <w:t xml:space="preserve">McCrae, R. R., &amp; Costa, P. T., Jr. (2008). The five-factor theory of personality. In O. P. John, R. W. Robins, &amp; L. A. Pervin (Eds.), </w:t>
+      </w:r>
+      <w:r>
+        <w:rPr>
+          <w:i/>
+          <w:iCs/>
+        </w:rPr>
+        <w:t xml:space="preserve">Handbook of personality</w:t>
+      </w:r>
+      <w:r>
+        <w:t xml:space="preserve"> (3rd ed., pp. 159-181). Guilford Press.</w:t>
       </w:r>
     </w:p>
     <w:p>
@@ -18954,13 +19075,17 @@
         <w:jc w:val="both"/>
       </w:pPr>
       <w:r>
-        <w:t>Mõttus, R., Kandler, C., Bleidorn, W., Riemann, R., &amp; McCrae, R. R. (2017). Personality traits below facets: The consensual validity, longitudinal stability, heritability, and utility of personality nuances. Journal of Personality and Social Psychology, 112(3), 474</w:t>
-      </w:r>
-      <w:r>
-        <w:t>-</w:t>
-      </w:r>
-      <w:r>
-        <w:t>490. https://doi.org/10.1037/pspp0000100</w:t>
+        <w:t xml:space="preserve">McCullagh, P. (1980). Regression models for ordinal data. </w:t>
+      </w:r>
+      <w:r>
+        <w:rPr>
+          <w:i/>
+          <w:iCs/>
+        </w:rPr>
+        <w:t xml:space="preserve">Journal of the Royal Statistical Society: Series B, 42</w:t>
+      </w:r>
+      <w:r>
+        <w:t xml:space="preserve">(2), 109-142. https://doi.org/10.1111/j.2517-6161.1980.tb01109.x</w:t>
       </w:r>
     </w:p>
     <w:p>
@@ -18970,13 +19095,17 @@
         <w:jc w:val="both"/>
       </w:pPr>
       <w:r>
-        <w:t>Nelson, J. A. (2015). Are women really more risk-averse than men? A re-analysis of the literature using expanded methods. Journal of Economic Surveys, 29(3), 566</w:t>
-      </w:r>
-      <w:r>
-        <w:t>-</w:t>
-      </w:r>
-      <w:r>
-        <w:t>585. https://doi.org/10.1111/joes.12069</w:t>
+        <w:t xml:space="preserve">Mõttus, R., Kandler, C., Bleidorn, W., Riemann, R., &amp; McCrae, R. R. (2017). Personality traits below facets: The consensual validity, longitudinal stability, heritability, and utility of personality nuances. </w:t>
+      </w:r>
+      <w:r>
+        <w:rPr>
+          <w:i/>
+          <w:iCs/>
+        </w:rPr>
+        <w:t xml:space="preserve">Journal of Personality and Social Psychology, 112</w:t>
+      </w:r>
+      <w:r>
+        <w:t xml:space="preserve">(3), 474-490. https://doi.org/10.1037/pspp0000100</w:t>
       </w:r>
     </w:p>
     <w:p>
@@ -18986,13 +19115,17 @@
         <w:jc w:val="both"/>
       </w:pPr>
       <w:r>
-        <w:t>Nicholson, N., Soane, E., Fenton-O’Creevy, M., &amp; Willman, P. (2005). Personality and domain-specific risk taking. Journal of Risk Research, 8(2), 157</w:t>
-      </w:r>
-      <w:r>
-        <w:t>-</w:t>
-      </w:r>
-      <w:r>
-        <w:t>176. https://doi.org/10.1080/1366987032000123856</w:t>
+        <w:t xml:space="preserve">Nelson, J. A. (2015). Are women really more risk-averse than men? A re-analysis of the literature using expanded methods. </w:t>
+      </w:r>
+      <w:r>
+        <w:rPr>
+          <w:i/>
+          <w:iCs/>
+        </w:rPr>
+        <w:t xml:space="preserve">Journal of Economic Surveys, 29</w:t>
+      </w:r>
+      <w:r>
+        <w:t xml:space="preserve">(3), 566-585. https://doi.org/10.1111/joes.12069</w:t>
       </w:r>
     </w:p>
     <w:p>
@@ -19002,7 +19135,17 @@
         <w:jc w:val="both"/>
       </w:pPr>
       <w:r>
-        <w:t>Nunnally, J. C., &amp; Bernstein, I. H. (1994). Psychometric theory (3rd ed.). McGraw-Hill.</w:t>
+        <w:t xml:space="preserve">Nicholson, N., Soane, E., Fenton-O’Creevy, M., &amp; Willman, P. (2005). Personality and domain-specific risk taking. </w:t>
+      </w:r>
+      <w:r>
+        <w:rPr>
+          <w:i/>
+          <w:iCs/>
+        </w:rPr>
+        <w:t xml:space="preserve">Journal of Risk Research, 8</w:t>
+      </w:r>
+      <w:r>
+        <w:t xml:space="preserve">(2), 157-176. https://doi.org/10.1080/1366987032000123856</w:t>
       </w:r>
     </w:p>
     <w:p>
@@ -19012,14 +19155,17 @@
         <w:jc w:val="both"/>
       </w:pPr>
       <w:r>
-        <w:lastRenderedPageBreak/>
-        <w:t>Rammstedt, B., &amp; John, O. P. (2007). Measuring personality in one minute or less: A 10-item short version of the Big Five Inventory. Journal of Research in Personality, 41(1), 203</w:t>
-      </w:r>
-      <w:r>
-        <w:t>-</w:t>
-      </w:r>
-      <w:r>
-        <w:t>212. https://doi.org/10.1016/j.jrp.2006.02.001</w:t>
+        <w:t xml:space="preserve">Nunnally, J. C., &amp; Bernstein, I. H. (1994). </w:t>
+      </w:r>
+      <w:r>
+        <w:rPr>
+          <w:i/>
+          <w:iCs/>
+        </w:rPr>
+        <w:t xml:space="preserve">Psychometric theory</w:t>
+      </w:r>
+      <w:r>
+        <w:t xml:space="preserve"> (3rd ed.). McGraw-Hill.</w:t>
       </w:r>
     </w:p>
     <w:p>
@@ -19029,13 +19175,17 @@
         <w:jc w:val="both"/>
       </w:pPr>
       <w:r>
-        <w:t>Rustichini, A., DeYoung, C. G., Anderson, J. E., &amp; Burks, S. V. (2016). Toward the integration of personality theory and decision theory in explaining economic behavior. Journal of Behavioral and Experimental Economics, 64, 122</w:t>
-      </w:r>
-      <w:r>
-        <w:t>-</w:t>
-      </w:r>
-      <w:r>
-        <w:t>137. https://doi.org/10.1016/j.socec.2016.04.019</w:t>
+        <w:t xml:space="preserve">Rammstedt, B., &amp; John, O. P. (2007). Measuring personality in one minute or less: A 10-item short version of the Big Five Inventory. </w:t>
+      </w:r>
+      <w:r>
+        <w:rPr>
+          <w:i/>
+          <w:iCs/>
+        </w:rPr>
+        <w:t xml:space="preserve">Journal of Research in Personality, 41</w:t>
+      </w:r>
+      <w:r>
+        <w:t xml:space="preserve">(1), 203-212. https://doi.org/10.1016/j.jrp.2006.02.001</w:t>
       </w:r>
     </w:p>
     <w:p>
@@ -19045,7 +19195,17 @@
         <w:jc w:val="both"/>
       </w:pPr>
       <w:r>
-        <w:t>Strauss, J., Witoelar, F., &amp; Sikoki, B. (2016). The Fifth Wave of the Indonesia Family Life Survey: Overview and field report (Working Paper WR-1143/1-NIA/NICHD). RAND Corporation.</w:t>
+        <w:t xml:space="preserve">Rustichini, A., DeYoung, C. G., Anderson, J. E., &amp; Burks, S. V. (2016). Toward the integration of personality theory and decision theory in explaining economic behavior. </w:t>
+      </w:r>
+      <w:r>
+        <w:rPr>
+          <w:i/>
+          <w:iCs/>
+        </w:rPr>
+        <w:t xml:space="preserve">Journal of Behavioral and Experimental Economics, 64</w:t>
+      </w:r>
+      <w:r>
+        <w:t xml:space="preserve">, 122-137. https://doi.org/10.1016/j.socec.2016.04.019</w:t>
       </w:r>
     </w:p>
     <w:p>
@@ -19055,13 +19215,17 @@
         <w:jc w:val="both"/>
       </w:pPr>
       <w:r>
-        <w:t>Tanaka, T., Camerer, C. F., &amp; Nguyen, Q. (2010). Risk and time preferences: Linking experimental and household survey data from Vietnam. American Economic Review, 100(1), 557</w:t>
-      </w:r>
-      <w:r>
-        <w:t>-</w:t>
-      </w:r>
-      <w:r>
-        <w:t>571. https://doi.org/10.1257/aer.100.1.557</w:t>
+        <w:t xml:space="preserve">Strauss, J., Witoelar, F., &amp; Sikoki, B. (2016). </w:t>
+      </w:r>
+      <w:r>
+        <w:rPr>
+          <w:i/>
+          <w:iCs/>
+        </w:rPr>
+        <w:t xml:space="preserve">The Fifth Wave of the Indonesia Family Life Survey: Overview and field report</w:t>
+      </w:r>
+      <w:r>
+        <w:t xml:space="preserve"> (Working Paper WR-1143/1-NIA/NICHD). RAND Corporation.</w:t>
       </w:r>
     </w:p>
     <w:p>
@@ -19071,7 +19235,17 @@
         <w:jc w:val="both"/>
       </w:pPr>
       <w:r>
-        <w:t>Thamarapani, D., &amp; Rockmore, M. (2022). Risk preferences, gender, and stakes: Evidence from Indonesia. Journal of Development Economics, 158, 102901. https://doi.org/10.1016/j.jdeveco.2022.102901</w:t>
+        <w:t xml:space="preserve">Tanaka, T., Camerer, C. F., &amp; Nguyen, Q. (2010). Risk and time preferences: Linking experimental and household survey data from Vietnam. </w:t>
+      </w:r>
+      <w:r>
+        <w:rPr>
+          <w:i/>
+          <w:iCs/>
+        </w:rPr>
+        <w:t xml:space="preserve">American Economic Review, 100</w:t>
+      </w:r>
+      <w:r>
+        <w:t xml:space="preserve">(1), 557-571. https://doi.org/10.1257/aer.100.1.557</w:t>
       </w:r>
     </w:p>
     <w:p>
@@ -19081,7 +19255,17 @@
         <w:jc w:val="both"/>
       </w:pPr>
       <w:r>
-        <w:t>Venables, W. N., &amp; Ripley, B. D. (2002). Modern applied statistics with S (4th ed.). Springer.</w:t>
+        <w:t xml:space="preserve">Thamarapani, D., &amp; Rockmore, M. (2022). Risk preferences, gender, and stakes: Evidence from Indonesia. </w:t>
+      </w:r>
+      <w:r>
+        <w:rPr>
+          <w:i/>
+          <w:iCs/>
+        </w:rPr>
+        <w:t xml:space="preserve">Journal of Development Economics, 158</w:t>
+      </w:r>
+      <w:r>
+        <w:t xml:space="preserve">, 102901. https://doi.org/10.1016/j.jdeveco.2022.102901</w:t>
       </w:r>
     </w:p>
     <w:p>
@@ -19091,13 +19275,17 @@
         <w:jc w:val="both"/>
       </w:pPr>
       <w:r>
-        <w:t>Vieider, F. M., Lefebvre, M., Bouchouicha, R., Chmura, T., Hakimov, R., Krawczyk, M., &amp; Martinsson, P. (2015). Common components of risk and uncertainty attitudes across contexts and domains: Evidence from 30 countries. Journal of the European Economic Association, 13(3), 421</w:t>
-      </w:r>
-      <w:r>
-        <w:t>-</w:t>
-      </w:r>
-      <w:r>
-        <w:t>452. https://doi.org/10.1111/jeea.12102</w:t>
+        <w:t xml:space="preserve">Venables, W. N., &amp; Ripley, B. D. (2002). </w:t>
+      </w:r>
+      <w:r>
+        <w:rPr>
+          <w:i/>
+          <w:iCs/>
+        </w:rPr>
+        <w:t xml:space="preserve">Modern applied statistics with S</w:t>
+      </w:r>
+      <w:r>
+        <w:t xml:space="preserve"> (4th ed.). Springer.</w:t>
       </w:r>
     </w:p>
     <w:p>
@@ -19107,13 +19295,37 @@
         <w:jc w:val="both"/>
       </w:pPr>
       <w:r>
-        <w:t>Weber, E. U., Blais, A.-R., &amp; Betz, N. E. (2002). A domain-specific risk-attitude scale: Measuring risk perceptions and risk behaviors. Journal of Behavioral Decision Making, 15(4), 263</w:t>
-      </w:r>
-      <w:r>
-        <w:t>-</w:t>
-      </w:r>
-      <w:r>
-        <w:t>290. https://doi.org/10.1002/bdm.414</w:t>
+        <w:t xml:space="preserve">Vieider, F. M., Lefebvre, M., Bouchouicha, R., Chmura, T., Hakimov, R., Krawczyk, M., &amp; Martinsson, P. (2015). Common components of risk and uncertainty attitudes across contexts and domains: Evidence from 30 countries. </w:t>
+      </w:r>
+      <w:r>
+        <w:rPr>
+          <w:i/>
+          <w:iCs/>
+        </w:rPr>
+        <w:t xml:space="preserve">Journal of the European Economic Association, 13</w:t>
+      </w:r>
+      <w:r>
+        <w:t xml:space="preserve">(3), 421-452. https://doi.org/10.1111/jeea.12102</w:t>
+      </w:r>
+    </w:p>
+    <w:p>
+      <w:pPr>
+        <w:spacing w:after="80" w:line="480" w:lineRule="auto"/>
+        <w:ind w:left="1440" w:hanging="720"/>
+        <w:jc w:val="both"/>
+      </w:pPr>
+      <w:r>
+        <w:t xml:space="preserve">Weber, E. U., Blais, A.-R., &amp; Betz, N. E. (2002). A domain-specific risk-attitude scale: Measuring risk perceptions and risk behaviors. </w:t>
+      </w:r>
+      <w:r>
+        <w:rPr>
+          <w:i/>
+          <w:iCs/>
+        </w:rPr>
+        <w:t xml:space="preserve">Journal of Behavioral Decision Making, 15</w:t>
+      </w:r>
+      <w:r>
+        <w:t xml:space="preserve">(4), 263-290. https://doi.org/10.1002/bdm.414</w:t>
       </w:r>
     </w:p>
     <w:p/>
@@ -19125,6 +19337,30 @@
     </w:sectPr>
   </w:body>
 </w:document>
+</file>
+
+<file path=word/comments.xml><?xml version="1.0" encoding="utf-8"?>
+<w:comments xmlns:wpc="http://schemas.microsoft.com/office/word/2010/wordprocessingCanvas" xmlns:mo="http://schemas.microsoft.com/office/mac/office/2008/main" xmlns:mc="http://schemas.openxmlformats.org/markup-compatibility/2006" xmlns:mv="urn:schemas-microsoft-com:mac:vml" xmlns:o="urn:schemas-microsoft-com:office:office" xmlns:r="http://schemas.openxmlformats.org/officeDocument/2006/relationships" xmlns:m="http://schemas.openxmlformats.org/officeDocument/2006/math" xmlns:v="urn:schemas-microsoft-com:vml" xmlns:wp14="http://schemas.microsoft.com/office/word/2010/wordprocessingDrawing" xmlns:wp="http://schemas.openxmlformats.org/drawingml/2006/wordprocessingDrawing" xmlns:w10="urn:schemas-microsoft-com:office:word" xmlns:w="http://schemas.openxmlformats.org/wordprocessingml/2006/main" xmlns:w14="http://schemas.microsoft.com/office/word/2010/wordml" xmlns:wpg="http://schemas.microsoft.com/office/word/2010/wordprocessingGroup" xmlns:wpi="http://schemas.microsoft.com/office/word/2010/wordprocessingInk" xmlns:wne="http://schemas.microsoft.com/office/word/2006/wordml" xmlns:wps="http://schemas.microsoft.com/office/word/2010/wordprocessingShape" mc:Ignorable="w14 wp14">
+</w:comments>
+</file>
+
+<file path=word/footnotes.xml><?xml version="1.0" encoding="utf-8"?>
+<w:footnotes xmlns:wpc="http://schemas.microsoft.com/office/word/2010/wordprocessingCanvas" xmlns:mo="http://schemas.microsoft.com/office/mac/office/2008/main" xmlns:mc="http://schemas.openxmlformats.org/markup-compatibility/2006" xmlns:mv="urn:schemas-microsoft-com:mac:vml" xmlns:o="urn:schemas-microsoft-com:office:office" xmlns:r="http://schemas.openxmlformats.org/officeDocument/2006/relationships" xmlns:m="http://schemas.openxmlformats.org/officeDocument/2006/math" xmlns:v="urn:schemas-microsoft-com:vml" xmlns:wp14="http://schemas.microsoft.com/office/word/2010/wordprocessingDrawing" xmlns:wp="http://schemas.openxmlformats.org/drawingml/2006/wordprocessingDrawing" xmlns:w10="urn:schemas-microsoft-com:office:word" xmlns:w="http://schemas.openxmlformats.org/wordprocessingml/2006/main" xmlns:w14="http://schemas.microsoft.com/office/word/2010/wordml" xmlns:wpg="http://schemas.microsoft.com/office/word/2010/wordprocessingGroup" xmlns:wpi="http://schemas.microsoft.com/office/word/2010/wordprocessingInk" xmlns:wne="http://schemas.microsoft.com/office/word/2006/wordml" xmlns:wps="http://schemas.microsoft.com/office/word/2010/wordprocessingShape" mc:Ignorable="w14 wp14">
+  <w:footnote w:type="separator" w:id="-1">
+    <w:p>
+      <w:r>
+        <w:separator/>
+      </w:r>
+    </w:p>
+  </w:footnote>
+  <w:footnote w:type="continuationSeparator" w:id="0">
+    <w:p>
+      <w:r>
+        <w:continuationSeparator/>
+      </w:r>
+    </w:p>
+  </w:footnote>
+</w:footnotes>
 </file>
 
 <file path=word/styles.xml><?xml version="1.0" encoding="utf-8"?>

</xml_diff>